<commit_message>
update WMO FOSS Guide build
</commit_message>
<xml_diff>
--- a/guide/wmo-foss-guide-DRAFT.docx
+++ b/guide/wmo-foss-guide-DRAFT.docx
@@ -57,7 +57,7 @@
         <w:pStyle w:val="Date"/>
       </w:pPr>
       <w:r>
-        <w:t xml:space="preserve">2026-08-04</w:t>
+        <w:t xml:space="preserve">2026-10-07</w:t>
       </w:r>
     </w:p>
     <w:p>
@@ -4740,7 +4740,7 @@
                 <w:rPr>
                   <w:rStyle w:val="Hyperlink"/>
                 </w:rPr>
-                <w:t xml:space="preserve">wis2-gdc</w:t>
+                <w:t xml:space="preserve">wmo-resource-catalogue</w:t>
               </w:r>
             </w:hyperlink>
           </w:p>
@@ -4752,7 +4752,7 @@
               <w:jc w:val="left"/>
             </w:pPr>
             <w:r>
-              <w:t xml:space="preserve">Global Discovery Catalogue</w:t>
+              <w:t xml:space="preserve">WMO Resource Catalogue (WIS2 Global Discovery Catalogue, WIGOS Global Observing Facility Catalogue)</w:t>
             </w:r>
           </w:p>
         </w:tc>

</xml_diff>